<commit_message>
Updated data wrangling strategy
</commit_message>
<xml_diff>
--- a/CHL8010 Proposal Data Wrangling Strategy.docx
+++ b/CHL8010 Proposal Data Wrangling Strategy.docx
@@ -194,7 +194,7 @@
         <w:rPr>
           <w:rtl w:val="0"/>
         </w:rPr>
-        <w:t xml:space="preserve">HEIGHT: the patient’s height in feet and inches (ex. 5’6).</w:t>
+        <w:t xml:space="preserve">HEIGHT: the patient’s height in feet and inches (ex. 5’ 6).</w:t>
       </w:r>
     </w:p>
     <w:p>
@@ -278,7 +278,7 @@
         <w:rPr>
           <w:rtl w:val="0"/>
         </w:rPr>
-        <w:t xml:space="preserve">The patient labs table contains information for 29,079,344 lab test results across 56,127 unique encounters. The table contains duplicated rows, which will be dropped (leaving only one row per unique instance) during the analysis. The variables of interest are</w:t>
+        <w:t xml:space="preserve">The patient labs table contains information for 29,079,344 lab test results across 56,127 unique encounters. The variables of interest are</w:t>
       </w:r>
     </w:p>
     <w:p>
@@ -584,7 +584,47 @@
         <w:rPr>
           <w:rtl w:val="0"/>
         </w:rPr>
-        <w:t xml:space="preserve">We will calculate the patient’s BMI as weight in kilograms divided by height in meters squared [2]. To facilitate this calculation, we will first treat the missing values in height and weight, then convert height from feet and inches into meters and weight from ounces into kilograms.</w:t>
+        <w:t xml:space="preserve">We will calculate the patient’s BMI as weight in kilograms divided by height in meters squared [2]. To facilitate this calculation, we will first treat the missing values in height and weight then convert height from feet and inches into meters and weight from ounces into kilograms using the following conversion formulas:</w:t>
+      </w:r>
+    </w:p>
+    <w:p>
+      <w:pPr>
+        <w:numPr>
+          <w:ilvl w:val="0"/>
+          <w:numId w:val="5"/>
+        </w:numPr>
+        <w:spacing w:after="0" w:afterAutospacing="0" w:before="240" w:lineRule="auto"/>
+        <w:ind w:left="720" w:hanging="360"/>
+        <w:jc w:val="both"/>
+        <w:rPr>
+          <w:u w:val="none"/>
+        </w:rPr>
+      </w:pPr>
+      <w:r>
+        <w:rPr>
+          <w:rtl w:val="0"/>
+        </w:rPr>
+        <w:t xml:space="preserve">Height in meters = ((feet * 12) + inches) * 0.0254</w:t>
+      </w:r>
+    </w:p>
+    <w:p>
+      <w:pPr>
+        <w:numPr>
+          <w:ilvl w:val="0"/>
+          <w:numId w:val="5"/>
+        </w:numPr>
+        <w:spacing w:after="240" w:before="0" w:beforeAutospacing="0" w:lineRule="auto"/>
+        <w:ind w:left="720" w:hanging="360"/>
+        <w:jc w:val="both"/>
+        <w:rPr>
+          <w:u w:val="none"/>
+        </w:rPr>
+      </w:pPr>
+      <w:r>
+        <w:rPr>
+          <w:rtl w:val="0"/>
+        </w:rPr>
+        <w:t xml:space="preserve">Weight in kilograms = weight in ounces* 0.0283</w:t>
       </w:r>
     </w:p>
     <w:p>
@@ -610,7 +650,20 @@
         <w:rPr>
           <w:rtl w:val="0"/>
         </w:rPr>
-        <w:t xml:space="preserve">Before attempting imputation, we will visually inspect the missingness pattern. If the data appears to be MNAR, we consider retaining only the complete cases for subsequent analysis.</w:t>
+        <w:t xml:space="preserve">We will validate the imputation results by comparing the distribution of height and weight before and after imputation to ensure their forms and shapes remain consistent. </w:t>
+      </w:r>
+    </w:p>
+    <w:p>
+      <w:pPr>
+        <w:spacing w:after="240" w:before="240" w:lineRule="auto"/>
+        <w:jc w:val="both"/>
+        <w:rPr/>
+      </w:pPr>
+      <w:r>
+        <w:rPr>
+          <w:rtl w:val="0"/>
+        </w:rPr>
+        <w:t xml:space="preserve">Before attempting imputation, we will inspect the missingness patterns using visualizations such as heatmaps. If the data appears to be MCAR or MNAR where the proposed imputation methods would be biased or inappropriate, we will instead retain only the encounters with no missing values for height and weight.</w:t>
       </w:r>
     </w:p>
     <w:p>
@@ -655,7 +708,7 @@
         <w:rPr>
           <w:rtl w:val="0"/>
         </w:rPr>
-        <w:t xml:space="preserve">The anesthesia start time and lab test results collection time are both stored as object variables, which will need to be converted into datetime format to allow for accurate filtering and comparison during subsequent wrangling. For the same purpose, we will only include encounters and lab test instances with non-missing anesthesia star time and collection time, respectively.</w:t>
+        <w:t xml:space="preserve">The anesthesia start time and lab test results collection time are both stored as object variables, which will need to be converted into datetime format to allow for accurate filtering and comparison during subsequent wrangling. For the same purpose, we will only include encounters and lab test instances with non-missing anesthesia start time and collection time, respectively.</w:t>
       </w:r>
     </w:p>
     <w:p>
@@ -682,28 +735,49 @@
         <w:rPr>
           <w:rtl w:val="0"/>
         </w:rPr>
-        <w:t xml:space="preserve">We will follow the outlined procedure to select relevant laboratory tests. For each encounter, the merged data is filtered to include only those tests conducted prior to the anesthesia start time. We then filter the lab results to include only the ten lab tests of interest based on the Lab Name variable. For lab types with multiple names, we select only the most common lab names. For example, the Leukocytes test has entries such as "Leukocytes" or "Leukocytes^^corrected for nucleated erythrocytes" under the Lab Name variable; we filter based on the most common version, which is the latter. Finally, the latest available instance of each lab test result prior to surgery is selected and stored in the final dataset. </w:t>
-      </w:r>
-    </w:p>
-    <w:p>
-      <w:pPr>
-        <w:rPr/>
-      </w:pPr>
-      <w:r>
-        <w:rPr>
-          <w:rtl w:val="0"/>
-        </w:rPr>
-      </w:r>
-    </w:p>
-    <w:p>
-      <w:pPr>
-        <w:rPr/>
-      </w:pPr>
-      <w:r>
-        <w:rPr>
-          <w:rtl w:val="0"/>
-        </w:rPr>
-        <w:t xml:space="preserve">For the observed test results and measurement units, values recorded as 999999 and "unknown," respectively, are considered missing. We will skip these specific lab test instances to ensure that only records with complete information are retained.</w:t>
+        <w:t xml:space="preserve">We will follow the procedure outlined below to select relevant laboratory tests. </w:t>
+      </w:r>
+    </w:p>
+    <w:p>
+      <w:pPr>
+        <w:rPr/>
+      </w:pPr>
+      <w:r>
+        <w:rPr>
+          <w:rtl w:val="0"/>
+        </w:rPr>
+      </w:r>
+    </w:p>
+    <w:p>
+      <w:pPr>
+        <w:rPr/>
+      </w:pPr>
+      <w:r>
+        <w:rPr>
+          <w:rtl w:val="0"/>
+        </w:rPr>
+        <w:t xml:space="preserve">For each encounter, the merged data is filtered to include only those tests conducted prior to the anesthesia start time. We then filter the lab results to include only the ten lab tests of interest based on the Lab Name and Lab Name variables. Since each test can have multiple Lab Name values and each Lab Name can correspond to multiple Lab Code values, we will pre-specify a unique code-name pair for each of the ten tests of interest. These pairs will be the most common name and code for each specific test type. For example, if “Carbon dioxide” and “2028-9” are the most common name and code for the Carbon dioxide test, we will restrict the lab tests to those matching this specific pair. Finally, the latest available instance of each lab test result prior to surgery is selected and stored in the final dataset. </w:t>
+      </w:r>
+    </w:p>
+    <w:p>
+      <w:pPr>
+        <w:rPr/>
+      </w:pPr>
+      <w:r>
+        <w:rPr>
+          <w:rtl w:val="0"/>
+        </w:rPr>
+      </w:r>
+    </w:p>
+    <w:p>
+      <w:pPr>
+        <w:rPr/>
+      </w:pPr>
+      <w:r>
+        <w:rPr>
+          <w:rtl w:val="0"/>
+        </w:rPr>
+        <w:t xml:space="preserve">For the observed test results and measurement units, values recorded as 9999999.0 and "Unknown," respectively, are considered missing. We will skip these specific lab test instances to ensure that only records with complete information are retained.</w:t>
       </w:r>
       <w:r>
         <w:rPr>
@@ -1268,6 +1342,116 @@
       </w:rPr>
     </w:lvl>
   </w:abstractNum>
+  <w:abstractNum w:abstractNumId="5">
+    <w:lvl w:ilvl="0">
+      <w:start w:val="1"/>
+      <w:numFmt w:val="decimal"/>
+      <w:lvlText w:val="%1."/>
+      <w:lvlJc w:val="left"/>
+      <w:pPr>
+        <w:ind w:left="720" w:hanging="360"/>
+      </w:pPr>
+      <w:rPr>
+        <w:u w:val="none"/>
+      </w:rPr>
+    </w:lvl>
+    <w:lvl w:ilvl="1">
+      <w:start w:val="1"/>
+      <w:numFmt w:val="lowerLetter"/>
+      <w:lvlText w:val="%2."/>
+      <w:lvlJc w:val="left"/>
+      <w:pPr>
+        <w:ind w:left="1440" w:hanging="360"/>
+      </w:pPr>
+      <w:rPr>
+        <w:u w:val="none"/>
+      </w:rPr>
+    </w:lvl>
+    <w:lvl w:ilvl="2">
+      <w:start w:val="1"/>
+      <w:numFmt w:val="lowerRoman"/>
+      <w:lvlText w:val="%3."/>
+      <w:lvlJc w:val="right"/>
+      <w:pPr>
+        <w:ind w:left="2160" w:hanging="360"/>
+      </w:pPr>
+      <w:rPr>
+        <w:u w:val="none"/>
+      </w:rPr>
+    </w:lvl>
+    <w:lvl w:ilvl="3">
+      <w:start w:val="1"/>
+      <w:numFmt w:val="decimal"/>
+      <w:lvlText w:val="%4."/>
+      <w:lvlJc w:val="left"/>
+      <w:pPr>
+        <w:ind w:left="2880" w:hanging="360"/>
+      </w:pPr>
+      <w:rPr>
+        <w:u w:val="none"/>
+      </w:rPr>
+    </w:lvl>
+    <w:lvl w:ilvl="4">
+      <w:start w:val="1"/>
+      <w:numFmt w:val="lowerLetter"/>
+      <w:lvlText w:val="%5."/>
+      <w:lvlJc w:val="left"/>
+      <w:pPr>
+        <w:ind w:left="3600" w:hanging="360"/>
+      </w:pPr>
+      <w:rPr>
+        <w:u w:val="none"/>
+      </w:rPr>
+    </w:lvl>
+    <w:lvl w:ilvl="5">
+      <w:start w:val="1"/>
+      <w:numFmt w:val="lowerRoman"/>
+      <w:lvlText w:val="%6."/>
+      <w:lvlJc w:val="right"/>
+      <w:pPr>
+        <w:ind w:left="4320" w:hanging="360"/>
+      </w:pPr>
+      <w:rPr>
+        <w:u w:val="none"/>
+      </w:rPr>
+    </w:lvl>
+    <w:lvl w:ilvl="6">
+      <w:start w:val="1"/>
+      <w:numFmt w:val="decimal"/>
+      <w:lvlText w:val="%7."/>
+      <w:lvlJc w:val="left"/>
+      <w:pPr>
+        <w:ind w:left="5040" w:hanging="360"/>
+      </w:pPr>
+      <w:rPr>
+        <w:u w:val="none"/>
+      </w:rPr>
+    </w:lvl>
+    <w:lvl w:ilvl="7">
+      <w:start w:val="1"/>
+      <w:numFmt w:val="lowerLetter"/>
+      <w:lvlText w:val="%8."/>
+      <w:lvlJc w:val="left"/>
+      <w:pPr>
+        <w:ind w:left="5760" w:hanging="360"/>
+      </w:pPr>
+      <w:rPr>
+        <w:u w:val="none"/>
+      </w:rPr>
+    </w:lvl>
+    <w:lvl w:ilvl="8">
+      <w:start w:val="1"/>
+      <w:numFmt w:val="lowerRoman"/>
+      <w:lvlText w:val="%9."/>
+      <w:lvlJc w:val="right"/>
+      <w:pPr>
+        <w:ind w:left="6480" w:hanging="360"/>
+      </w:pPr>
+      <w:rPr>
+        <w:u w:val="none"/>
+      </w:rPr>
+    </w:lvl>
+  </w:abstractNum>
   <w:num w:numId="1">
     <w:abstractNumId w:val="1"/>
   </w:num>
@@ -1279,6 +1463,9 @@
   </w:num>
   <w:num w:numId="4">
     <w:abstractNumId w:val="4"/>
+  </w:num>
+  <w:num w:numId="5">
+    <w:abstractNumId w:val="5"/>
   </w:num>
 </w:numbering>
 </file>

</xml_diff>

<commit_message>
Updated data wrangling section 4.2 and 4.4
</commit_message>
<xml_diff>
--- a/CHL8010 Proposal Data Wrangling Strategy.docx
+++ b/CHL8010 Proposal Data Wrangling Strategy.docx
@@ -12,8 +12,6 @@
         <w:rPr>
           <w:b w:val="1"/>
           <w:bCs w:val="1"/>
-          <w:sz w:val="34"/>
-          <w:szCs w:val="34"/>
         </w:rPr>
       </w:pPr>
       <w:bookmarkStart w:colFirst="0" w:colLast="0" w:name="_vr6rgce8hfg4" w:id="0"/>
@@ -22,8 +20,6 @@
         <w:rPr>
           <w:b w:val="1"/>
           <w:bCs w:val="1"/>
-          <w:sz w:val="34"/>
-          <w:szCs w:val="34"/>
           <w:rtl w:val="0"/>
         </w:rPr>
         <w:t xml:space="preserve">1. Overview</w:t>
@@ -52,8 +48,6 @@
         <w:rPr>
           <w:b w:val="1"/>
           <w:bCs w:val="1"/>
-          <w:sz w:val="34"/>
-          <w:szCs w:val="34"/>
         </w:rPr>
       </w:pPr>
       <w:bookmarkStart w:colFirst="0" w:colLast="0" w:name="_o2ee9ahgrhuy" w:id="1"/>
@@ -62,8 +56,6 @@
         <w:rPr>
           <w:b w:val="1"/>
           <w:bCs w:val="1"/>
-          <w:sz w:val="34"/>
-          <w:szCs w:val="34"/>
           <w:rtl w:val="0"/>
         </w:rPr>
         <w:t xml:space="preserve">2. Source Data Tables and Relevant Features</w:t>
@@ -372,8 +364,6 @@
         <w:rPr>
           <w:b w:val="1"/>
           <w:bCs w:val="1"/>
-          <w:sz w:val="34"/>
-          <w:szCs w:val="34"/>
         </w:rPr>
       </w:pPr>
       <w:bookmarkStart w:colFirst="0" w:colLast="0" w:name="_dfk5lo9bzg3c" w:id="5"/>
@@ -382,11 +372,9 @@
         <w:rPr>
           <w:b w:val="1"/>
           <w:bCs w:val="1"/>
-          <w:sz w:val="34"/>
-          <w:szCs w:val="34"/>
-          <w:rtl w:val="0"/>
-        </w:rPr>
-        <w:t xml:space="preserve">3. Data Integration</w:t>
+          <w:rtl w:val="0"/>
+        </w:rPr>
+        <w:t xml:space="preserve">3. Data Integration and Restructuring</w:t>
       </w:r>
     </w:p>
     <w:p>
@@ -487,8 +475,6 @@
         <w:rPr>
           <w:b w:val="1"/>
           <w:bCs w:val="1"/>
-          <w:sz w:val="34"/>
-          <w:szCs w:val="34"/>
         </w:rPr>
       </w:pPr>
       <w:bookmarkStart w:colFirst="0" w:colLast="0" w:name="_9epcb9mw6r2t" w:id="6"/>
@@ -497,11 +483,9 @@
         <w:rPr>
           <w:b w:val="1"/>
           <w:bCs w:val="1"/>
-          <w:sz w:val="34"/>
-          <w:szCs w:val="34"/>
-          <w:rtl w:val="0"/>
-        </w:rPr>
-        <w:t xml:space="preserve">4. Data Cleaning and Feature Engineering</w:t>
+          <w:rtl w:val="0"/>
+        </w:rPr>
+        <w:t xml:space="preserve">4. Data Cleaning, Transformation and Feature Engineering</w:t>
       </w:r>
     </w:p>
     <w:p>
@@ -675,7 +659,30 @@
         <w:rPr>
           <w:rtl w:val="0"/>
         </w:rPr>
-        <w:t xml:space="preserve">There are no missing values in the age and sex fields.</w:t>
+        <w:t xml:space="preserve">The SEX variable is binary with values “Female” and “Male”, except for one encounter where the value is "Unknown." Since this patient has only a single recorded encounter, the missing value cannot be inferred based on the available data. We will thus drop this encounter from further analysis.</w:t>
+      </w:r>
+    </w:p>
+    <w:p>
+      <w:pPr>
+        <w:jc w:val="both"/>
+        <w:rPr/>
+      </w:pPr>
+      <w:r>
+        <w:rPr>
+          <w:rtl w:val="0"/>
+        </w:rPr>
+      </w:r>
+    </w:p>
+    <w:p>
+      <w:pPr>
+        <w:jc w:val="both"/>
+        <w:rPr/>
+      </w:pPr>
+      <w:r>
+        <w:rPr>
+          <w:rtl w:val="0"/>
+        </w:rPr>
+        <w:t xml:space="preserve">There are no missing values in the age variable. </w:t>
       </w:r>
       <w:r>
         <w:rPr>
@@ -735,6 +742,32 @@
         <w:rPr>
           <w:rtl w:val="0"/>
         </w:rPr>
+        <w:t xml:space="preserve">The Observation Value variable contains an outlier value of 9999999.0, which we will treat as missing. For Measurement Units, missing values are recorded as "Unknown." We will filter the merged data to exclude all entries with an Observation Value of 9999999.0, regardless of the corresponding unit's availability. We will retain results with missing Measurement Units because certain laboratory tests, such as pH, are unitless in nature.</w:t>
+      </w:r>
+      <w:r>
+        <w:rPr>
+          <w:rtl w:val="0"/>
+        </w:rPr>
+      </w:r>
+    </w:p>
+    <w:p>
+      <w:pPr>
+        <w:rPr/>
+      </w:pPr>
+      <w:r>
+        <w:rPr>
+          <w:rtl w:val="0"/>
+        </w:rPr>
+      </w:r>
+    </w:p>
+    <w:p>
+      <w:pPr>
+        <w:rPr/>
+      </w:pPr>
+      <w:r>
+        <w:rPr>
+          <w:rtl w:val="0"/>
+        </w:rPr>
         <w:t xml:space="preserve">We will follow the procedure outlined below to select relevant laboratory tests. </w:t>
       </w:r>
     </w:p>
@@ -756,29 +789,55 @@
         <w:rPr>
           <w:rtl w:val="0"/>
         </w:rPr>
-        <w:t xml:space="preserve">For each encounter, the merged data is filtered to include only those tests conducted prior to the anesthesia start time. We then filter the lab results to include only the ten lab tests of interest based on the Lab Name and Lab Name variables. Since each test can have multiple Lab Name values and each Lab Name can correspond to multiple Lab Code values, we will pre-specify a unique code-name pair for each of the ten tests of interest. These pairs will be the most common name and code for each specific test type. For example, if “Carbon dioxide” and “2028-9” are the most common name and code for the Carbon dioxide test, we will restrict the lab tests to those matching this specific pair. Finally, the latest available instance of each lab test result prior to surgery is selected and stored in the final dataset. </w:t>
-      </w:r>
-    </w:p>
-    <w:p>
-      <w:pPr>
-        <w:rPr/>
-      </w:pPr>
-      <w:r>
-        <w:rPr>
-          <w:rtl w:val="0"/>
-        </w:rPr>
-      </w:r>
-    </w:p>
-    <w:p>
-      <w:pPr>
-        <w:rPr/>
-      </w:pPr>
-      <w:r>
-        <w:rPr>
-          <w:rtl w:val="0"/>
-        </w:rPr>
-        <w:t xml:space="preserve">For the observed test results and measurement units, values recorded as 9999999.0 and "Unknown," respectively, are considered missing. We will skip these specific lab test instances to ensure that only records with complete information are retained.</w:t>
-      </w:r>
+        <w:t xml:space="preserve">Since each test can have multiple Lab Name values, we will choose the most common Lab Name value for each test. This will be done by filtering the merged data for entries with a Lab Name value containing the name of the desired test, ignoring case. We will then calculate the total number of entries with each distinct Lab Name value for that test and choose the Lab Name value with the largest total number of entries.  </w:t>
+      </w:r>
+    </w:p>
+    <w:p>
+      <w:pPr>
+        <w:rPr/>
+      </w:pPr>
+      <w:r>
+        <w:rPr>
+          <w:rtl w:val="0"/>
+        </w:rPr>
+      </w:r>
+    </w:p>
+    <w:p>
+      <w:pPr>
+        <w:rPr/>
+      </w:pPr>
+      <w:r>
+        <w:rPr>
+          <w:rtl w:val="0"/>
+        </w:rPr>
+        <w:t xml:space="preserve">We will then choose the corresponding Lab Code value for each test by including only entries with a Lab Name value equal to the selected most common Lab Name value for that test. Then, we will calculate the total number of entries with each distinct Lab Code value corresponding to that Lab Name. We will choose the Lab Code value with the largest total number of entries. This will give us a Lab Code-Lab Name pair of values for each test (10 pairs in total). We will then filter the merged data to only include entries containing these 10 Lab Code values and these 10 Lab Name values. </w:t>
+      </w:r>
+    </w:p>
+    <w:p>
+      <w:pPr>
+        <w:rPr/>
+      </w:pPr>
+      <w:r>
+        <w:rPr>
+          <w:rtl w:val="0"/>
+        </w:rPr>
+      </w:r>
+    </w:p>
+    <w:p>
+      <w:pPr>
+        <w:rPr/>
+      </w:pPr>
+      <w:r>
+        <w:rPr>
+          <w:rtl w:val="0"/>
+        </w:rPr>
+        <w:t xml:space="preserve">For each encounter, we will restrict the merged data to only include laboratory tests with a Collection Datetime prior to the anesthesia start time. Finally, we will retain only the latest available instance for each laboratory test result prior to anesthesia.</w:t>
+      </w:r>
+    </w:p>
+    <w:p>
+      <w:pPr>
+        <w:rPr/>
+      </w:pPr>
       <w:r>
         <w:rPr>
           <w:rtl w:val="0"/>
@@ -795,8 +854,6 @@
         <w:rPr>
           <w:b w:val="1"/>
           <w:bCs w:val="1"/>
-          <w:sz w:val="34"/>
-          <w:szCs w:val="34"/>
         </w:rPr>
       </w:pPr>
       <w:bookmarkStart w:colFirst="0" w:colLast="0" w:name="_jtfa3xpxio7v" w:id="11"/>
@@ -805,8 +862,6 @@
         <w:rPr>
           <w:b w:val="1"/>
           <w:bCs w:val="1"/>
-          <w:sz w:val="34"/>
-          <w:szCs w:val="34"/>
           <w:rtl w:val="0"/>
         </w:rPr>
         <w:t xml:space="preserve">5. Citations</w:t>

</xml_diff>

<commit_message>
Updated Data Integration and Restructuring section
</commit_message>
<xml_diff>
--- a/CHL8010 Proposal Data Wrangling Strategy.docx
+++ b/CHL8010 Proposal Data Wrangling Strategy.docx
@@ -71,7 +71,7 @@
         <w:rPr>
           <w:rtl w:val="0"/>
         </w:rPr>
-        <w:t xml:space="preserve">Relevant information on patient demographics, lab test results and postoperative hypoxemia status are obtained from three primary data tables from the MOVER dataset [1]. The relevant variables from these tables are outlined in the Data Mapping section. All three data tables are at the encounter level, and share the same unique identifiers for each encounter for each patient (namely, the log id (LOG_ID) and medical record number (MRN)). </w:t>
+        <w:t xml:space="preserve">Relevant information on patient demographics, lab test results and postoperative hypoxemia status are obtained from three primary data tables from the MOVER dataset [1]. The relevant variables from these tables are outlined in the Data Mapping section. All three data tables are at the encounter level, and share the same unique identifiers for each encounter (namely, the log id (LOG_ID)).</w:t>
       </w:r>
     </w:p>
     <w:p>
@@ -99,7 +99,7 @@
         <w:rPr>
           <w:rtl w:val="0"/>
         </w:rPr>
-        <w:t xml:space="preserve">The postoperative complications table contains information on 56,127 encounters. The primary variable of interest within this table is SMRTDTA_ELEM_VALUE, which contains the specific names of postoperative complications. </w:t>
+        <w:t xml:space="preserve">The postoperative complications table contains information on 64,214 encounters. The primary variable of interest within this table is SMRTDTA_ELEM_VALUE, which contains the specific names of postoperative complications. </w:t>
       </w:r>
     </w:p>
     <w:p>
@@ -127,7 +127,7 @@
         <w:rPr>
           <w:rtl w:val="0"/>
         </w:rPr>
-        <w:t xml:space="preserve">The patient information table contains information on 65,728 encounters. The descriptions of variables of interest are listed below:</w:t>
+        <w:t xml:space="preserve">The patient information table contains information on 64,354 encounters. The descriptions of variables of interest are listed below:</w:t>
       </w:r>
     </w:p>
     <w:p>
@@ -270,7 +270,7 @@
         <w:rPr>
           <w:rtl w:val="0"/>
         </w:rPr>
-        <w:t xml:space="preserve">The patient labs table contains information for 29,079,344 lab test results across 56,127 unique encounters. The variables of interest are</w:t>
+        <w:t xml:space="preserve">The patient labs table contains information for 29,079,344 lab test results across 56,125 unique encounters. The variables of interest are</w:t>
       </w:r>
     </w:p>
     <w:p>
@@ -410,7 +410,7 @@
         <w:rPr>
           <w:rtl w:val="0"/>
         </w:rPr>
-        <w:t xml:space="preserve">Postoperative hypoxemia table: containing log id, MRN, and postoperative complications.</w:t>
+        <w:t xml:space="preserve">Postoperative hypoxemia table: containing LOG_ID and postoperative complications</w:t>
       </w:r>
     </w:p>
     <w:p>
@@ -425,7 +425,7 @@
         <w:rPr>
           <w:rtl w:val="0"/>
         </w:rPr>
-        <w:t xml:space="preserve">Demographics table: with the columns log id, MRN, age, sex, and anesthesia start time.</w:t>
+        <w:t xml:space="preserve">Demographics table: containing LOG_ID, MRN, age, sex, and anesthesia start time</w:t>
       </w:r>
     </w:p>
     <w:p>
@@ -440,29 +440,59 @@
         <w:rPr>
           <w:rtl w:val="0"/>
         </w:rPr>
-        <w:t xml:space="preserve">Lab test results table: with the columns log id, MRN, lab code, lab name, value and unit of the results, and collection time.</w:t>
-      </w:r>
-    </w:p>
-    <w:p>
-      <w:pPr>
-        <w:ind w:left="720" w:firstLine="0"/>
-        <w:rPr/>
-      </w:pPr>
-      <w:r>
-        <w:rPr>
-          <w:rtl w:val="0"/>
-        </w:rPr>
-      </w:r>
-    </w:p>
-    <w:p>
-      <w:pPr>
-        <w:rPr/>
-      </w:pPr>
-      <w:r>
-        <w:rPr>
-          <w:rtl w:val="0"/>
-        </w:rPr>
-        <w:t xml:space="preserve">These three tables will then be merged into a comprehensive dataframe using log id and MRN. </w:t>
+        <w:t xml:space="preserve">Lab test results table: containing LOG_ID, lab code, lab name, value and unit of the results, and collection time</w:t>
+      </w:r>
+    </w:p>
+    <w:p>
+      <w:pPr>
+        <w:rPr/>
+      </w:pPr>
+      <w:r>
+        <w:rPr>
+          <w:rtl w:val="0"/>
+        </w:rPr>
+      </w:r>
+    </w:p>
+    <w:p>
+      <w:pPr>
+        <w:rPr>
+          <w:highlight w:val="white"/>
+        </w:rPr>
+      </w:pPr>
+      <w:r>
+        <w:rPr>
+          <w:rtl w:val="0"/>
+        </w:rPr>
+        <w:t xml:space="preserve">where LOG_ID uniquely identifies each encounter, and MRN (medical record number) uniquely identifies each patient. We identified four LOG_ID values associated with multiple</w:t>
+      </w:r>
+      <w:r>
+        <w:rPr>
+          <w:b w:val="1"/>
+          <w:bCs w:val="1"/>
+          <w:rtl w:val="0"/>
+        </w:rPr>
+        <w:t xml:space="preserve"> </w:t>
+      </w:r>
+      <w:r>
+        <w:rPr>
+          <w:rtl w:val="0"/>
+        </w:rPr>
+        <w:t xml:space="preserve">MRNs, indicating single encounters linked to multiple patients. To ensure data integrity, we will exclude encounters corresponding to these four LOG_IDs, so that each retained encounter corresponds to exactly one patient. As the analysis will focus on encounter-level prediction of postoperative hypoxemia, we will then merge the three dataframes by LOG_ID.</w:t>
+      </w:r>
+      <w:r>
+        <w:rPr>
+          <w:rtl w:val="0"/>
+        </w:rPr>
+      </w:r>
+    </w:p>
+    <w:p>
+      <w:pPr>
+        <w:rPr/>
+      </w:pPr>
+      <w:r>
+        <w:rPr>
+          <w:rtl w:val="0"/>
+        </w:rPr>
       </w:r>
     </w:p>
     <w:p>

</xml_diff>

<commit_message>
Modify Data Integration and Restructuring section to includ MRN in the 3 tables
</commit_message>
<xml_diff>
--- a/CHL8010 Proposal Data Wrangling Strategy.docx
+++ b/CHL8010 Proposal Data Wrangling Strategy.docx
@@ -410,7 +410,7 @@
         <w:rPr>
           <w:rtl w:val="0"/>
         </w:rPr>
-        <w:t xml:space="preserve">Postoperative hypoxemia table: containing LOG_ID and postoperative complications</w:t>
+        <w:t xml:space="preserve">Postoperative hypoxemia table: containing LOG_ID, MRN, and postoperative complications</w:t>
       </w:r>
     </w:p>
     <w:p>
@@ -440,7 +440,7 @@
         <w:rPr>
           <w:rtl w:val="0"/>
         </w:rPr>
-        <w:t xml:space="preserve">Lab test results table: containing LOG_ID, lab code, lab name, value and unit of the results, and collection time</w:t>
+        <w:t xml:space="preserve">Lab test results table: containing LOG_ID, MRN, lab code, lab name, value and unit of the results, and collection time</w:t>
       </w:r>
     </w:p>
     <w:p>

</xml_diff>